<commit_message>
docs: entrega final - atualiza README, relatorio e PDF; remove diario de bordo
</commit_message>
<xml_diff>
--- a/fase-01/relatorio_tecnico.docx
+++ b/fase-01/relatorio_tecnico.docx
@@ -182,6 +182,12 @@
     </w:p>
     <w:sdt>
       <w:sdtPr>
+        <w:rPr>
+          <w:rFonts w:ascii="Arial" w:eastAsia="Arial" w:hAnsi="Arial" w:cs="Arial"/>
+          <w:color w:val="auto"/>
+          <w:sz w:val="22"/>
+          <w:szCs w:val="22"/>
+        </w:rPr>
         <w:id w:val="1822464182"/>
         <w:docPartObj>
           <w:docPartGallery w:val="Table of Contents"/>
@@ -190,12 +196,8 @@
       </w:sdtPr>
       <w:sdtEndPr>
         <w:rPr>
-          <w:rFonts w:ascii="Arial" w:eastAsia="Arial" w:hAnsi="Arial" w:cs="Arial"/>
           <w:b/>
           <w:bCs/>
-          <w:color w:val="auto"/>
-          <w:sz w:val="22"/>
-          <w:szCs w:val="22"/>
         </w:rPr>
       </w:sdtEndPr>
       <w:sdtContent>
@@ -3394,16 +3396,10 @@
         <w:spacing w:after="160"/>
       </w:pPr>
       <w:r>
-        <w:t>Documento aqui</w:t>
-      </w:r>
-      <w:r>
-        <w:t xml:space="preserve"> o desenvolvimento de uma solução de Machine Learning para apoio ao diagnóstico de câncer de mama.</w:t>
-      </w:r>
-    </w:p>
-    <w:p>
-      <w:pPr>
-        <w:spacing w:after="160"/>
-      </w:pPr>
+        <w:t>Documento aqui o desenvolvimento de uma solução de Machine Learning para apoio ao diagnóstico de câncer de mama.</w:t>
+      </w:r>
+    </w:p>
+    <w:p>
       <w:r>
         <w:t>O desafio escolhido foi o Desafio B: uma rede de hospitais e centros de saúde especializados no atendimento à mulher busca implementar um sistema inteligente de suporte ao diagnóstico e detecção de riscos, capaz de ajudar profissionais de saúde na identificação precoce de condições que afetam a segurança e a saúde feminina.</w:t>
       </w:r>
@@ -3664,12 +3660,6 @@
         <w:gridCol w:w="2340"/>
       </w:tblGrid>
       <w:tr>
-        <w:tblPrEx>
-          <w:tblCellMar>
-            <w:top w:w="0" w:type="dxa"/>
-            <w:bottom w:w="0" w:type="dxa"/>
-          </w:tblCellMar>
-        </w:tblPrEx>
         <w:tc>
           <w:tcPr>
             <w:tcW w:w="4680" w:type="dxa"/>
@@ -3756,12 +3746,6 @@
         </w:tc>
       </w:tr>
       <w:tr>
-        <w:tblPrEx>
-          <w:tblCellMar>
-            <w:top w:w="0" w:type="dxa"/>
-            <w:bottom w:w="0" w:type="dxa"/>
-          </w:tblCellMar>
-        </w:tblPrEx>
         <w:tc>
           <w:tcPr>
             <w:tcW w:w="4680" w:type="dxa"/>
@@ -3833,12 +3817,6 @@
         </w:tc>
       </w:tr>
       <w:tr>
-        <w:tblPrEx>
-          <w:tblCellMar>
-            <w:top w:w="0" w:type="dxa"/>
-            <w:bottom w:w="0" w:type="dxa"/>
-          </w:tblCellMar>
-        </w:tblPrEx>
         <w:tc>
           <w:tcPr>
             <w:tcW w:w="4680" w:type="dxa"/>
@@ -3973,10 +3951,7 @@
         <w:t>Embora esse</w:t>
       </w:r>
       <w:r>
-        <w:t xml:space="preserve"> desbalanceamento</w:t>
-      </w:r>
-      <w:r>
-        <w:t xml:space="preserve"> não </w:t>
+        <w:t xml:space="preserve"> desbalanceamento não </w:t>
       </w:r>
       <w:r>
         <w:t xml:space="preserve">seja </w:t>
@@ -3988,10 +3963,7 @@
         <w:t xml:space="preserve">o suficiente para </w:t>
       </w:r>
       <w:r>
-        <w:t xml:space="preserve">exigir técnicas </w:t>
-      </w:r>
-      <w:r>
-        <w:t xml:space="preserve">como SMOTE, </w:t>
+        <w:t xml:space="preserve">exigir técnicas como SMOTE, </w:t>
       </w:r>
       <w:r>
         <w:t xml:space="preserve">ele influencia </w:t>
@@ -4512,12 +4484,6 @@
         <w:gridCol w:w="2880"/>
       </w:tblGrid>
       <w:tr>
-        <w:tblPrEx>
-          <w:tblCellMar>
-            <w:top w:w="0" w:type="dxa"/>
-            <w:bottom w:w="0" w:type="dxa"/>
-          </w:tblCellMar>
-        </w:tblPrEx>
         <w:tc>
           <w:tcPr>
             <w:tcW w:w="1800" w:type="dxa"/>
@@ -4605,12 +4571,6 @@
         </w:tc>
       </w:tr>
       <w:tr>
-        <w:tblPrEx>
-          <w:tblCellMar>
-            <w:top w:w="0" w:type="dxa"/>
-            <w:bottom w:w="0" w:type="dxa"/>
-          </w:tblCellMar>
-        </w:tblPrEx>
         <w:tc>
           <w:tcPr>
             <w:tcW w:w="1800" w:type="dxa"/>
@@ -4682,12 +4642,6 @@
         </w:tc>
       </w:tr>
       <w:tr>
-        <w:tblPrEx>
-          <w:tblCellMar>
-            <w:top w:w="0" w:type="dxa"/>
-            <w:bottom w:w="0" w:type="dxa"/>
-          </w:tblCellMar>
-        </w:tblPrEx>
         <w:tc>
           <w:tcPr>
             <w:tcW w:w="1800" w:type="dxa"/>
@@ -4759,12 +4713,6 @@
         </w:tc>
       </w:tr>
       <w:tr>
-        <w:tblPrEx>
-          <w:tblCellMar>
-            <w:top w:w="0" w:type="dxa"/>
-            <w:bottom w:w="0" w:type="dxa"/>
-          </w:tblCellMar>
-        </w:tblPrEx>
         <w:tc>
           <w:tcPr>
             <w:tcW w:w="1800" w:type="dxa"/>
@@ -4836,12 +4784,6 @@
         </w:tc>
       </w:tr>
       <w:tr>
-        <w:tblPrEx>
-          <w:tblCellMar>
-            <w:top w:w="0" w:type="dxa"/>
-            <w:bottom w:w="0" w:type="dxa"/>
-          </w:tblCellMar>
-        </w:tblPrEx>
         <w:tc>
           <w:tcPr>
             <w:tcW w:w="1800" w:type="dxa"/>
@@ -4913,12 +4855,6 @@
         </w:tc>
       </w:tr>
       <w:tr>
-        <w:tblPrEx>
-          <w:tblCellMar>
-            <w:top w:w="0" w:type="dxa"/>
-            <w:bottom w:w="0" w:type="dxa"/>
-          </w:tblCellMar>
-        </w:tblPrEx>
         <w:tc>
           <w:tcPr>
             <w:tcW w:w="1800" w:type="dxa"/>
@@ -4990,12 +4926,6 @@
         </w:tc>
       </w:tr>
       <w:tr>
-        <w:tblPrEx>
-          <w:tblCellMar>
-            <w:top w:w="0" w:type="dxa"/>
-            <w:bottom w:w="0" w:type="dxa"/>
-          </w:tblCellMar>
-        </w:tblPrEx>
         <w:tc>
           <w:tcPr>
             <w:tcW w:w="1800" w:type="dxa"/>
@@ -5067,12 +4997,6 @@
         </w:tc>
       </w:tr>
       <w:tr>
-        <w:tblPrEx>
-          <w:tblCellMar>
-            <w:top w:w="0" w:type="dxa"/>
-            <w:bottom w:w="0" w:type="dxa"/>
-          </w:tblCellMar>
-        </w:tblPrEx>
         <w:tc>
           <w:tcPr>
             <w:tcW w:w="1800" w:type="dxa"/>
@@ -5237,12 +5161,6 @@
         <w:gridCol w:w="3120"/>
       </w:tblGrid>
       <w:tr>
-        <w:tblPrEx>
-          <w:tblCellMar>
-            <w:top w:w="0" w:type="dxa"/>
-            <w:bottom w:w="0" w:type="dxa"/>
-          </w:tblCellMar>
-        </w:tblPrEx>
         <w:tc>
           <w:tcPr>
             <w:tcW w:w="3120" w:type="dxa"/>
@@ -5329,12 +5247,6 @@
         </w:tc>
       </w:tr>
       <w:tr>
-        <w:tblPrEx>
-          <w:tblCellMar>
-            <w:top w:w="0" w:type="dxa"/>
-            <w:bottom w:w="0" w:type="dxa"/>
-          </w:tblCellMar>
-        </w:tblPrEx>
         <w:tc>
           <w:tcPr>
             <w:tcW w:w="3120" w:type="dxa"/>
@@ -5406,12 +5318,6 @@
         </w:tc>
       </w:tr>
       <w:tr>
-        <w:tblPrEx>
-          <w:tblCellMar>
-            <w:top w:w="0" w:type="dxa"/>
-            <w:bottom w:w="0" w:type="dxa"/>
-          </w:tblCellMar>
-        </w:tblPrEx>
         <w:tc>
           <w:tcPr>
             <w:tcW w:w="3120" w:type="dxa"/>
@@ -5604,13 +5510,7 @@
         <w:spacing w:after="160"/>
       </w:pPr>
       <w:r>
-        <w:t>Preferi escolher</w:t>
-      </w:r>
-      <w:r>
-        <w:t xml:space="preserve"> três algoritmos de classificação, representando abordagens distintas de Machine Learning, para enriquecer a comparação de desempenho</w:t>
-      </w:r>
-      <w:r>
-        <w:t>.</w:t>
+        <w:t>Preferi escolher três algoritmos de classificação, representando abordagens distintas de Machine Learning, para enriquecer a comparação de desempenho.</w:t>
       </w:r>
     </w:p>
     <w:p>
@@ -5628,10 +5528,7 @@
         <w:spacing w:after="160"/>
       </w:pPr>
       <w:r>
-        <w:t>Usei o m</w:t>
-      </w:r>
-      <w:r>
-        <w:t xml:space="preserve">odelo linear/estatístico clássico, que calcula uma combinação linear das features e converte o resultado em uma probabilidade de diagnóstico maligno. Vantagem: alta </w:t>
+        <w:t xml:space="preserve">Usei o modelo linear/estatístico clássico, que calcula uma combinação linear das features e converte o resultado em uma probabilidade de diagnóstico maligno. Vantagem: alta </w:t>
       </w:r>
       <w:proofErr w:type="spellStart"/>
       <w:r>
@@ -5647,25 +5544,7 @@
       </w:r>
       <w:proofErr w:type="spellEnd"/>
       <w:r>
-        <w:t xml:space="preserve"> identificada </w:t>
-      </w:r>
-      <w:r>
-        <w:t>anteriormente e r</w:t>
-      </w:r>
-      <w:r>
-        <w:t>etom</w:t>
-      </w:r>
-      <w:r>
-        <w:t>arei</w:t>
-      </w:r>
-      <w:r>
-        <w:t xml:space="preserve"> com evidências </w:t>
-      </w:r>
-      <w:r>
-        <w:t>a frente</w:t>
-      </w:r>
-      <w:r>
-        <w:t>.</w:t>
+        <w:t xml:space="preserve"> identificada anteriormente e retomarei com evidências a frente.</w:t>
       </w:r>
     </w:p>
     <w:p>
@@ -5883,12 +5762,6 @@
         <w:gridCol w:w="1500"/>
       </w:tblGrid>
       <w:tr>
-        <w:tblPrEx>
-          <w:tblCellMar>
-            <w:top w:w="0" w:type="dxa"/>
-            <w:bottom w:w="0" w:type="dxa"/>
-          </w:tblCellMar>
-        </w:tblPrEx>
         <w:tc>
           <w:tcPr>
             <w:tcW w:w="3360" w:type="dxa"/>
@@ -6035,12 +5908,6 @@
         </w:tc>
       </w:tr>
       <w:tr>
-        <w:tblPrEx>
-          <w:tblCellMar>
-            <w:top w:w="0" w:type="dxa"/>
-            <w:bottom w:w="0" w:type="dxa"/>
-          </w:tblCellMar>
-        </w:tblPrEx>
         <w:tc>
           <w:tcPr>
             <w:tcW w:w="3360" w:type="dxa"/>
@@ -6168,12 +6035,6 @@
         </w:tc>
       </w:tr>
       <w:tr>
-        <w:tblPrEx>
-          <w:tblCellMar>
-            <w:top w:w="0" w:type="dxa"/>
-            <w:bottom w:w="0" w:type="dxa"/>
-          </w:tblCellMar>
-        </w:tblPrEx>
         <w:tc>
           <w:tcPr>
             <w:tcW w:w="3360" w:type="dxa"/>
@@ -6291,12 +6152,6 @@
         </w:tc>
       </w:tr>
       <w:tr>
-        <w:tblPrEx>
-          <w:tblCellMar>
-            <w:top w:w="0" w:type="dxa"/>
-            <w:bottom w:w="0" w:type="dxa"/>
-          </w:tblCellMar>
-        </w:tblPrEx>
         <w:tc>
           <w:tcPr>
             <w:tcW w:w="3360" w:type="dxa"/>
@@ -6440,10 +6295,7 @@
         <w:spacing w:after="160"/>
       </w:pPr>
       <w:r>
-        <w:t>Contudo é importante ressaltar que um</w:t>
-      </w:r>
-      <w:r>
-        <w:t xml:space="preserve"> </w:t>
+        <w:t xml:space="preserve">Contudo é importante ressaltar que um </w:t>
       </w:r>
       <w:proofErr w:type="spellStart"/>
       <w:r>
@@ -6451,13 +6303,7 @@
       </w:r>
       <w:proofErr w:type="spellEnd"/>
       <w:r>
-        <w:t xml:space="preserve"> de 100% em um conjunto de teste de apenas 114 amostras é um resultado a ser interpretado com cautela</w:t>
-      </w:r>
-      <w:r>
-        <w:t>,</w:t>
-      </w:r>
-      <w:r>
-        <w:t xml:space="preserve"> pode refletir generalização real ou favorecimento parcial pela composição específica desse split. Isso motivou a realização de validação cruzada antes de eleger um modelo como superior.</w:t>
+        <w:t xml:space="preserve"> de 100% em um conjunto de teste de apenas 114 amostras é um resultado a ser interpretado com cautela, pode refletir generalização real ou favorecimento parcial pela composição específica desse split. Isso motivou a realização de validação cruzada antes de eleger um modelo como superior.</w:t>
       </w:r>
     </w:p>
     <w:p>
@@ -6613,12 +6459,6 @@
         <w:gridCol w:w="1800"/>
       </w:tblGrid>
       <w:tr>
-        <w:tblPrEx>
-          <w:tblCellMar>
-            <w:top w:w="0" w:type="dxa"/>
-            <w:bottom w:w="0" w:type="dxa"/>
-          </w:tblCellMar>
-        </w:tblPrEx>
         <w:tc>
           <w:tcPr>
             <w:tcW w:w="4680" w:type="dxa"/>
@@ -6705,12 +6545,6 @@
         </w:tc>
       </w:tr>
       <w:tr>
-        <w:tblPrEx>
-          <w:tblCellMar>
-            <w:top w:w="0" w:type="dxa"/>
-            <w:bottom w:w="0" w:type="dxa"/>
-          </w:tblCellMar>
-        </w:tblPrEx>
         <w:tc>
           <w:tcPr>
             <w:tcW w:w="4680" w:type="dxa"/>
@@ -6792,12 +6626,6 @@
         </w:tc>
       </w:tr>
       <w:tr>
-        <w:tblPrEx>
-          <w:tblCellMar>
-            <w:top w:w="0" w:type="dxa"/>
-            <w:bottom w:w="0" w:type="dxa"/>
-          </w:tblCellMar>
-        </w:tblPrEx>
         <w:tc>
           <w:tcPr>
             <w:tcW w:w="4680" w:type="dxa"/>
@@ -6869,12 +6697,6 @@
         </w:tc>
       </w:tr>
       <w:tr>
-        <w:tblPrEx>
-          <w:tblCellMar>
-            <w:top w:w="0" w:type="dxa"/>
-            <w:bottom w:w="0" w:type="dxa"/>
-          </w:tblCellMar>
-        </w:tblPrEx>
         <w:tc>
           <w:tcPr>
             <w:tcW w:w="4680" w:type="dxa"/>
@@ -7076,12 +6898,6 @@
         <w:gridCol w:w="2640"/>
       </w:tblGrid>
       <w:tr>
-        <w:tblPrEx>
-          <w:tblCellMar>
-            <w:top w:w="0" w:type="dxa"/>
-            <w:bottom w:w="0" w:type="dxa"/>
-          </w:tblCellMar>
-        </w:tblPrEx>
         <w:tc>
           <w:tcPr>
             <w:tcW w:w="3360" w:type="dxa"/>
@@ -7204,12 +7020,6 @@
         </w:tc>
       </w:tr>
       <w:tr>
-        <w:tblPrEx>
-          <w:tblCellMar>
-            <w:top w:w="0" w:type="dxa"/>
-            <w:bottom w:w="0" w:type="dxa"/>
-          </w:tblCellMar>
-        </w:tblPrEx>
         <w:tc>
           <w:tcPr>
             <w:tcW w:w="3360" w:type="dxa"/>
@@ -7291,12 +7101,6 @@
         </w:tc>
       </w:tr>
       <w:tr>
-        <w:tblPrEx>
-          <w:tblCellMar>
-            <w:top w:w="0" w:type="dxa"/>
-            <w:bottom w:w="0" w:type="dxa"/>
-          </w:tblCellMar>
-        </w:tblPrEx>
         <w:tc>
           <w:tcPr>
             <w:tcW w:w="3360" w:type="dxa"/>
@@ -7368,12 +7172,6 @@
         </w:tc>
       </w:tr>
       <w:tr>
-        <w:tblPrEx>
-          <w:tblCellMar>
-            <w:top w:w="0" w:type="dxa"/>
-            <w:bottom w:w="0" w:type="dxa"/>
-          </w:tblCellMar>
-        </w:tblPrEx>
         <w:tc>
           <w:tcPr>
             <w:tcW w:w="3360" w:type="dxa"/>
@@ -7631,10 +7429,7 @@
         <w:spacing w:after="160"/>
       </w:pPr>
       <w:r>
-        <w:t xml:space="preserve">Me aprofundei para tentar encontrar a causa dessa divergência. </w:t>
-      </w:r>
-      <w:r>
-        <w:t xml:space="preserve">Três verificações independentes confirmaram a hipótese de </w:t>
+        <w:t xml:space="preserve">Me aprofundei para tentar encontrar a causa dessa divergência. Três verificações independentes confirmaram a hipótese de </w:t>
       </w:r>
       <w:proofErr w:type="spellStart"/>
       <w:r>
@@ -7642,13 +7437,7 @@
       </w:r>
       <w:proofErr w:type="spellEnd"/>
       <w:r>
-        <w:t xml:space="preserve"> distorcendo os coeficientes da Regressão Logística</w:t>
-      </w:r>
-      <w:r>
-        <w:t xml:space="preserve"> como esperado</w:t>
-      </w:r>
-      <w:r>
-        <w:t>:</w:t>
+        <w:t xml:space="preserve"> distorcendo os coeficientes da Regressão Logística como esperado:</w:t>
       </w:r>
     </w:p>
     <w:p>
@@ -7908,16 +7697,7 @@
         <w:spacing w:after="160"/>
       </w:pPr>
       <w:r>
-        <w:t>Por isso acabei decidindo por manter a</w:t>
-      </w:r>
-      <w:r>
-        <w:t xml:space="preserve"> Regressão Logística como modelo preditivo principal do projeto, por apresentar o maior recall médio em validação cruzada</w:t>
-      </w:r>
-      <w:r>
-        <w:t>,</w:t>
-      </w:r>
-      <w:r>
-        <w:t xml:space="preserve"> a </w:t>
+        <w:t xml:space="preserve">Por isso acabei decidindo por manter a Regressão Logística como modelo preditivo principal do projeto, por apresentar o maior recall médio em validação cruzada, a </w:t>
       </w:r>
       <w:proofErr w:type="spellStart"/>
       <w:r>
@@ -7958,10 +7738,7 @@
       </w:r>
       <w:proofErr w:type="spellEnd"/>
       <w:r>
-        <w:t xml:space="preserve"> concluir que o t</w:t>
-      </w:r>
-      <w:r>
-        <w:t>amanho (</w:t>
+        <w:t xml:space="preserve"> concluir que o tamanho (</w:t>
       </w:r>
       <w:proofErr w:type="spellStart"/>
       <w:r>
@@ -8042,10 +7819,7 @@
       <w:bookmarkStart w:id="49" w:name="sec8"/>
       <w:bookmarkStart w:id="50" w:name="_Toc233314075"/>
       <w:r>
-        <w:t>7</w:t>
-      </w:r>
-      <w:r>
-        <w:t>. Uso Prático do Modelo</w:t>
+        <w:t>7. Uso Prático do Modelo</w:t>
       </w:r>
       <w:bookmarkEnd w:id="49"/>
       <w:bookmarkEnd w:id="50"/>
@@ -8056,10 +7830,7 @@
       </w:pPr>
       <w:bookmarkStart w:id="51" w:name="_Toc233314076"/>
       <w:r>
-        <w:t>7</w:t>
-      </w:r>
-      <w:r>
-        <w:t>.1 O modelo pode ser utilizado na prática?</w:t>
+        <w:t>7.1 O modelo pode ser utilizado na prática?</w:t>
       </w:r>
       <w:bookmarkEnd w:id="51"/>
     </w:p>
@@ -8083,10 +7854,7 @@
       </w:pPr>
       <w:bookmarkStart w:id="52" w:name="_Toc233314077"/>
       <w:r>
-        <w:t>7</w:t>
-      </w:r>
-      <w:r>
-        <w:t>.2 Como o modelo poderia ser utilizado?</w:t>
+        <w:t>7.2 Como o modelo poderia ser utilizado?</w:t>
       </w:r>
       <w:bookmarkEnd w:id="52"/>
     </w:p>
@@ -8132,16 +7900,7 @@
         <w:spacing w:after="100"/>
       </w:pPr>
       <w:r>
-        <w:t xml:space="preserve">Fins </w:t>
-      </w:r>
-      <w:r>
-        <w:t>educacio</w:t>
-      </w:r>
-      <w:r>
-        <w:t>nais</w:t>
-      </w:r>
-      <w:r>
-        <w:t>: auxiliando na padronização de critérios de avaliação entre diferentes profissionais.</w:t>
+        <w:t>Fins educacionais: auxiliando na padronização de critérios de avaliação entre diferentes profissionais.</w:t>
       </w:r>
     </w:p>
     <w:p>
@@ -8150,10 +7909,7 @@
       </w:pPr>
       <w:bookmarkStart w:id="53" w:name="_Toc233314078"/>
       <w:r>
-        <w:t>7</w:t>
-      </w:r>
-      <w:r>
-        <w:t>.3 Limitações</w:t>
+        <w:t>7.3 Limitações</w:t>
       </w:r>
       <w:bookmarkEnd w:id="53"/>
     </w:p>
@@ -8250,10 +8006,7 @@
       <w:bookmarkStart w:id="55" w:name="_Toc233314079"/>
       <w:r>
         <w:lastRenderedPageBreak/>
-        <w:t>8</w:t>
-      </w:r>
-      <w:r>
-        <w:t>. Conclusão</w:t>
+        <w:t>8. Conclusão</w:t>
       </w:r>
       <w:bookmarkEnd w:id="54"/>
       <w:bookmarkEnd w:id="55"/>
@@ -8355,10 +8108,7 @@
       <w:bookmarkStart w:id="56" w:name="sec10"/>
       <w:bookmarkStart w:id="57" w:name="_Toc233314080"/>
       <w:r>
-        <w:t>9</w:t>
-      </w:r>
-      <w:r>
-        <w:t>. Informações Complementares</w:t>
+        <w:t>9. Informações Complementares</w:t>
       </w:r>
       <w:bookmarkEnd w:id="56"/>
       <w:bookmarkEnd w:id="57"/>
@@ -8369,10 +8119,7 @@
       </w:pPr>
       <w:bookmarkStart w:id="58" w:name="_Toc233314081"/>
       <w:r>
-        <w:t>9</w:t>
-      </w:r>
-      <w:r>
-        <w:t>.1 Repositório do projeto</w:t>
+        <w:t>9.1 Repositório do projeto</w:t>
       </w:r>
       <w:bookmarkEnd w:id="58"/>
     </w:p>
@@ -8381,7 +8128,13 @@
         <w:spacing w:after="160"/>
       </w:pPr>
       <w:r>
-        <w:t xml:space="preserve">Código-fonte completo, notebooks, módulos Python reutilizáveis e o histórico cronológico de decisões (diário de bordo) estão disponíveis em: </w:t>
+        <w:t>Código-fonte completo, notebooks, módulos Python reutilizáveis</w:t>
+      </w:r>
+      <w:r>
+        <w:t xml:space="preserve"> </w:t>
+      </w:r>
+      <w:r>
+        <w:t xml:space="preserve">estão disponíveis em: </w:t>
       </w:r>
     </w:p>
     <w:p>
@@ -8403,10 +8156,7 @@
       </w:pPr>
       <w:bookmarkStart w:id="59" w:name="_Toc233314082"/>
       <w:r>
-        <w:t>9</w:t>
-      </w:r>
-      <w:r>
-        <w:t>.2 Vídeo de demonstração</w:t>
+        <w:t>9.2 Vídeo de demonstração</w:t>
       </w:r>
       <w:bookmarkEnd w:id="59"/>
     </w:p>
@@ -8424,10 +8174,7 @@
       </w:pPr>
       <w:bookmarkStart w:id="60" w:name="_Toc233314083"/>
       <w:r>
-        <w:t>9</w:t>
-      </w:r>
-      <w:r>
-        <w:t xml:space="preserve">.3 Fonte do </w:t>
+        <w:t xml:space="preserve">9.3 Fonte do </w:t>
       </w:r>
       <w:proofErr w:type="spellStart"/>
       <w:r>

</xml_diff>

<commit_message>
docs: inclusao do video de demonstracao e atualizacao dos entregaveis finais
- README.md: adicionado link do vídeo de demonstração
- relatorio_tecnico.docx e PDF: versões finais atualizadas com link do vídeo
- notebooks 01 e 04: ajustes finais de apresentação

Co-Authored-By: Claude Sonnet 4.6 <noreply@anthropic.com>
</commit_message>
<xml_diff>
--- a/fase-01/relatorio_tecnico.docx
+++ b/fase-01/relatorio_tecnico.docx
@@ -49,52 +49,20 @@
           <w:sz w:val="24"/>
           <w:szCs w:val="24"/>
         </w:rPr>
-        <w:t xml:space="preserve">Pós-Graduação em IA para </w:t>
-      </w:r>
-      <w:proofErr w:type="spellStart"/>
+        <w:t>Pós-Graduação em IA para Devs — FIAP</w:t>
+      </w:r>
+    </w:p>
+    <w:p>
+      <w:pPr>
+        <w:spacing w:before="200"/>
+        <w:jc w:val="center"/>
+      </w:pPr>
       <w:r>
         <w:rPr>
           <w:sz w:val="24"/>
           <w:szCs w:val="24"/>
         </w:rPr>
-        <w:t>Devs</w:t>
-      </w:r>
-      <w:proofErr w:type="spellEnd"/>
-      <w:r>
-        <w:rPr>
-          <w:sz w:val="24"/>
-          <w:szCs w:val="24"/>
-        </w:rPr>
-        <w:t xml:space="preserve"> — FIAP</w:t>
-      </w:r>
-    </w:p>
-    <w:p>
-      <w:pPr>
-        <w:spacing w:before="200"/>
-        <w:jc w:val="center"/>
-      </w:pPr>
-      <w:r>
-        <w:rPr>
-          <w:sz w:val="24"/>
-          <w:szCs w:val="24"/>
-        </w:rPr>
-        <w:t xml:space="preserve">Fase 1 (IA </w:t>
-      </w:r>
-      <w:proofErr w:type="spellStart"/>
-      <w:r>
-        <w:rPr>
-          <w:sz w:val="24"/>
-          <w:szCs w:val="24"/>
-        </w:rPr>
-        <w:t>Foundations</w:t>
-      </w:r>
-      <w:proofErr w:type="spellEnd"/>
-      <w:r>
-        <w:rPr>
-          <w:sz w:val="24"/>
-          <w:szCs w:val="24"/>
-        </w:rPr>
-        <w:t>)</w:t>
+        <w:t>Fase 1 (IA Foundations)</w:t>
       </w:r>
     </w:p>
     <w:p>
@@ -3421,13 +3389,8 @@
         <w:spacing w:after="160"/>
       </w:pPr>
       <w:r>
-        <w:t xml:space="preserve">Construir uma solução inicial de Machine Learning para classificação de diagnóstico (maligno ou benigno) a partir de dados clínicos tabulares, aplicando fundamentos de análise exploratória de dados, pré-processamento, modelagem preditiva, validação estatística e </w:t>
-      </w:r>
-      <w:proofErr w:type="spellStart"/>
-      <w:r>
-        <w:t>interpretabilidade</w:t>
-      </w:r>
-      <w:proofErr w:type="spellEnd"/>
+        <w:t>Construir uma solução inicial de Machine Learning para classificação de diagnóstico (maligno ou benigno) a partir de dados clínicos tabulares, aplicando fundamentos de análise exploratória de dados, pré-processamento, modelagem preditiva, validação estatística e interpretabilidade</w:t>
+      </w:r>
       <w:r>
         <w:t xml:space="preserve"> </w:t>
       </w:r>
@@ -3442,70 +3405,17 @@
       <w:bookmarkStart w:id="4" w:name="sec1_3"/>
       <w:bookmarkStart w:id="5" w:name="_Toc233314050"/>
       <w:r>
-        <w:t xml:space="preserve">1.3 </w:t>
-      </w:r>
-      <w:proofErr w:type="spellStart"/>
-      <w:r>
-        <w:t>Dataset</w:t>
+        <w:t>1.3 Dataset</w:t>
       </w:r>
       <w:bookmarkEnd w:id="4"/>
       <w:bookmarkEnd w:id="5"/>
-      <w:proofErr w:type="spellEnd"/>
     </w:p>
     <w:p>
       <w:pPr>
         <w:spacing w:after="160"/>
       </w:pPr>
       <w:r>
-        <w:t xml:space="preserve">Foi utilizado o </w:t>
-      </w:r>
-      <w:proofErr w:type="spellStart"/>
-      <w:r>
-        <w:t>dataset</w:t>
-      </w:r>
-      <w:proofErr w:type="spellEnd"/>
-      <w:r>
-        <w:t xml:space="preserve"> </w:t>
-      </w:r>
-      <w:proofErr w:type="spellStart"/>
-      <w:r>
-        <w:t>Breast</w:t>
-      </w:r>
-      <w:proofErr w:type="spellEnd"/>
-      <w:r>
-        <w:t xml:space="preserve"> </w:t>
-      </w:r>
-      <w:proofErr w:type="spellStart"/>
-      <w:r>
-        <w:t>Cancer</w:t>
-      </w:r>
-      <w:proofErr w:type="spellEnd"/>
-      <w:r>
-        <w:t xml:space="preserve"> Wisconsin (</w:t>
-      </w:r>
-      <w:proofErr w:type="spellStart"/>
-      <w:r>
-        <w:t>Diagnostic</w:t>
-      </w:r>
-      <w:proofErr w:type="spellEnd"/>
-      <w:r>
-        <w:t xml:space="preserve">), obtido diretamente do UCI Machine Learning </w:t>
-      </w:r>
-      <w:proofErr w:type="spellStart"/>
-      <w:r>
-        <w:t>Repository</w:t>
-      </w:r>
-      <w:proofErr w:type="spellEnd"/>
-      <w:r>
-        <w:t xml:space="preserve">, por meio da biblioteca </w:t>
-      </w:r>
-      <w:proofErr w:type="spellStart"/>
-      <w:r>
-        <w:t>ucimlrepo</w:t>
-      </w:r>
-      <w:proofErr w:type="spellEnd"/>
-      <w:r>
-        <w:t>.</w:t>
+        <w:t>Foi utilizado o dataset Breast Cancer Wisconsin (Diagnostic), obtido diretamente do UCI Machine Learning Repository, por meio da biblioteca ucimlrepo.</w:t>
       </w:r>
     </w:p>
     <w:p>
@@ -3513,29 +3423,8 @@
         <w:spacing w:after="160"/>
       </w:pPr>
       <w:r>
-        <w:t xml:space="preserve">A escolha desta fonte, em vez de réplicas disponíveis no </w:t>
-      </w:r>
-      <w:proofErr w:type="spellStart"/>
-      <w:r>
-        <w:t>Kaggle</w:t>
-      </w:r>
-      <w:proofErr w:type="spellEnd"/>
-      <w:r>
-        <w:t xml:space="preserve"> ou no </w:t>
-      </w:r>
-      <w:proofErr w:type="spellStart"/>
-      <w:r>
-        <w:t>scikit-learn</w:t>
-      </w:r>
-      <w:proofErr w:type="spellEnd"/>
-      <w:r>
-        <w:t xml:space="preserve">, se justifica por ser a fonte primária do </w:t>
-      </w:r>
-      <w:proofErr w:type="spellStart"/>
-      <w:r>
-        <w:t>dataset</w:t>
-      </w:r>
-      <w:proofErr w:type="spellEnd"/>
+        <w:t>A escolha desta fonte, em vez de réplicas disponíveis no Kaggle ou no scikit-learn, se justifica por ser a fonte primária do dataset</w:t>
+      </w:r>
       <w:r>
         <w:t>,</w:t>
       </w:r>
@@ -3548,15 +3437,7 @@
         <w:spacing w:after="160"/>
       </w:pPr>
       <w:r>
-        <w:t xml:space="preserve">O </w:t>
-      </w:r>
-      <w:proofErr w:type="spellStart"/>
-      <w:r>
-        <w:t>dataset</w:t>
-      </w:r>
-      <w:proofErr w:type="spellEnd"/>
-      <w:r>
-        <w:t xml:space="preserve"> contém 569 amostras, com 30 features numéricas (10 características-base do núcleo celular</w:t>
+        <w:t>O dataset contém 569 amostras, com 30 features numéricas (10 características-base do núcleo celular</w:t>
       </w:r>
       <w:r>
         <w:t>,</w:t>
@@ -3606,15 +3487,7 @@
         <w:spacing w:after="160"/>
       </w:pPr>
       <w:r>
-        <w:t xml:space="preserve">O </w:t>
-      </w:r>
-      <w:proofErr w:type="spellStart"/>
-      <w:r>
-        <w:t>dataset</w:t>
-      </w:r>
-      <w:proofErr w:type="spellEnd"/>
-      <w:r>
-        <w:t xml:space="preserve"> apresenta 569 linhas e 31 colunas (30 features numéricas e a coluna de diagnóstico). A inspeção inicial não identificou nenhum valor ausente em nenhuma das 31 colunas, dispensando qualquer etapa de imputação no pré-processamento.</w:t>
+        <w:t>O dataset apresenta 569 linhas e 31 colunas (30 features numéricas e a coluna de diagnóstico). A inspeção inicial não identificou nenhum valor ausente em nenhuma das 31 colunas, dispensando qualquer etapa de imputação no pré-processamento.</w:t>
       </w:r>
     </w:p>
     <w:p>
@@ -4223,86 +4096,17 @@
       <w:bookmarkStart w:id="16" w:name="sec3_1"/>
       <w:bookmarkStart w:id="17" w:name="_Toc233314056"/>
       <w:r>
-        <w:t xml:space="preserve">3.1 Análise de correlação e </w:t>
-      </w:r>
-      <w:proofErr w:type="spellStart"/>
-      <w:r>
-        <w:t>multicolinearidade</w:t>
+        <w:t>3.1 Análise de correlação e multicolinearidade</w:t>
       </w:r>
       <w:bookmarkEnd w:id="16"/>
       <w:bookmarkEnd w:id="17"/>
-      <w:proofErr w:type="spellEnd"/>
     </w:p>
     <w:p>
       <w:pPr>
         <w:spacing w:after="160"/>
       </w:pPr>
       <w:r>
-        <w:t xml:space="preserve">A matriz de correlação entre as 30 features numéricas confirmou uma forte </w:t>
-      </w:r>
-      <w:proofErr w:type="spellStart"/>
-      <w:r>
-        <w:t>multicolinearidade</w:t>
-      </w:r>
-      <w:proofErr w:type="spellEnd"/>
-      <w:r>
-        <w:t xml:space="preserve"> entre variantes da mesma característica geométrica </w:t>
-      </w:r>
-      <w:proofErr w:type="spellStart"/>
-      <w:r>
-        <w:t>radius</w:t>
-      </w:r>
-      <w:proofErr w:type="spellEnd"/>
-      <w:r>
-        <w:t xml:space="preserve">, </w:t>
-      </w:r>
-      <w:proofErr w:type="spellStart"/>
-      <w:r>
-        <w:t>perimeter</w:t>
-      </w:r>
-      <w:proofErr w:type="spellEnd"/>
-      <w:r>
-        <w:t xml:space="preserve"> e </w:t>
-      </w:r>
-      <w:proofErr w:type="spellStart"/>
-      <w:r>
-        <w:t>area</w:t>
-      </w:r>
-      <w:proofErr w:type="spellEnd"/>
-      <w:r>
-        <w:t xml:space="preserve"> (nas três variantes: </w:t>
-      </w:r>
-      <w:proofErr w:type="spellStart"/>
-      <w:r>
-        <w:t>mean</w:t>
-      </w:r>
-      <w:proofErr w:type="spellEnd"/>
-      <w:r>
-        <w:t xml:space="preserve">, se, </w:t>
-      </w:r>
-      <w:proofErr w:type="spellStart"/>
-      <w:r>
-        <w:t>worst</w:t>
-      </w:r>
-      <w:proofErr w:type="spellEnd"/>
-      <w:r>
-        <w:t xml:space="preserve">) apresentam correlação próxima de 0.99 entre si, resultado matematicamente esperado, já que raio, perímetro e área de uma estrutura aproximadamente circular são dependentes entre si. Padrão semelhante foi observado entre </w:t>
-      </w:r>
-      <w:proofErr w:type="spellStart"/>
-      <w:r>
-        <w:t>concavity</w:t>
-      </w:r>
-      <w:proofErr w:type="spellEnd"/>
-      <w:r>
-        <w:t xml:space="preserve"> e </w:t>
-      </w:r>
-      <w:proofErr w:type="spellStart"/>
-      <w:r>
-        <w:t>concave_points</w:t>
-      </w:r>
-      <w:proofErr w:type="spellEnd"/>
-      <w:r>
-        <w:t>.</w:t>
+        <w:t>A matriz de correlação entre as 30 features numéricas confirmou uma forte multicolinearidade entre variantes da mesma característica geométrica radius, perimeter e area (nas três variantes: mean, se, worst) apresentam correlação próxima de 0.99 entre si, resultado matematicamente esperado, já que raio, perímetro e área de uma estrutura aproximadamente circular são dependentes entre si. Padrão semelhante foi observado entre concavity e concave_points.</w:t>
       </w:r>
     </w:p>
     <w:p>
@@ -4359,29 +4163,13 @@
         <w:spacing w:after="160"/>
       </w:pPr>
       <w:r>
-        <w:t xml:space="preserve">Diante dessa </w:t>
-      </w:r>
-      <w:proofErr w:type="spellStart"/>
-      <w:r>
-        <w:t>multicolinearidade</w:t>
-      </w:r>
-      <w:proofErr w:type="spellEnd"/>
-      <w:r>
-        <w:t xml:space="preserve">, </w:t>
+        <w:t xml:space="preserve">Diante dessa multicolinearidade, </w:t>
       </w:r>
       <w:r>
         <w:t>optei</w:t>
       </w:r>
       <w:r>
-        <w:t xml:space="preserve"> por manter todas as 30 features no </w:t>
-      </w:r>
-      <w:proofErr w:type="spellStart"/>
-      <w:r>
-        <w:t>dataset</w:t>
-      </w:r>
-      <w:proofErr w:type="spellEnd"/>
-      <w:r>
-        <w:t xml:space="preserve">, em vez de removê-las manualmente ou aplicar redução de dimensionalidade (PCA). </w:t>
+        <w:t xml:space="preserve"> por manter todas as 30 features no dataset, em vez de removê-las manualmente ou aplicar redução de dimensionalidade (PCA). </w:t>
       </w:r>
       <w:r>
         <w:t>Tomei e</w:t>
@@ -4399,31 +4187,7 @@
         <w:t>r</w:t>
       </w:r>
       <w:r>
-        <w:t xml:space="preserve"> a </w:t>
-      </w:r>
-      <w:proofErr w:type="spellStart"/>
-      <w:r>
-        <w:t>interpretabilidade</w:t>
-      </w:r>
-      <w:proofErr w:type="spellEnd"/>
-      <w:r>
-        <w:t xml:space="preserve"> exigida pelo desafio (feature </w:t>
-      </w:r>
-      <w:proofErr w:type="spellStart"/>
-      <w:r>
-        <w:t>importance</w:t>
-      </w:r>
-      <w:proofErr w:type="spellEnd"/>
-      <w:r>
-        <w:t xml:space="preserve"> e SHAP), considerando que a </w:t>
-      </w:r>
-      <w:proofErr w:type="spellStart"/>
-      <w:r>
-        <w:t>multicolinearidade</w:t>
-      </w:r>
-      <w:proofErr w:type="spellEnd"/>
-      <w:r>
-        <w:t xml:space="preserve"> afeta principalmente a estabilidade dos coeficientes de modelos lineares</w:t>
+        <w:t xml:space="preserve"> a interpretabilidade exigida pelo desafio (feature importance e SHAP), considerando que a multicolinearidade afeta principalmente a estabilidade dos coeficientes de modelos lineares</w:t>
       </w:r>
       <w:r>
         <w:t>,</w:t>
@@ -5110,21 +4874,8 @@
         <w:spacing w:after="160"/>
       </w:pPr>
       <w:r>
-        <w:t>Os dados foram divididos em 80% treino e 20% teste, utilizando estratificação (</w:t>
-      </w:r>
-      <w:proofErr w:type="spellStart"/>
-      <w:r>
-        <w:t>stratify</w:t>
-      </w:r>
-      <w:proofErr w:type="spellEnd"/>
-      <w:r>
-        <w:t xml:space="preserve">=y) para preservar a proporção de classes em ambos os conjuntos, e </w:t>
-      </w:r>
-      <w:proofErr w:type="spellStart"/>
-      <w:r>
-        <w:t>random_state</w:t>
-      </w:r>
-      <w:proofErr w:type="spellEnd"/>
+        <w:t>Os dados foram divididos em 80% treino e 20% teste, utilizando estratificação (stratify=y) para preservar a proporção de classes em ambos os conjuntos, e random_state</w:t>
+      </w:r>
       <w:r>
         <w:t xml:space="preserve"> </w:t>
       </w:r>
@@ -5399,15 +5150,7 @@
         <w:spacing w:after="160"/>
       </w:pPr>
       <w:r>
-        <w:t xml:space="preserve">As proporções próximas entre si e do valor original do </w:t>
-      </w:r>
-      <w:proofErr w:type="spellStart"/>
-      <w:r>
-        <w:t>dataset</w:t>
-      </w:r>
-      <w:proofErr w:type="spellEnd"/>
-      <w:r>
-        <w:t xml:space="preserve"> completo (37.3%) confirmam que a estratificação funcionou corretamente.</w:t>
+        <w:t>As proporções próximas entre si e do valor original do dataset completo (37.3%) confirmam que a estratificação funcionou corretamente.</w:t>
       </w:r>
     </w:p>
     <w:p>
@@ -5417,15 +5160,7 @@
       <w:bookmarkStart w:id="21" w:name="sec3_3"/>
       <w:bookmarkStart w:id="22" w:name="_Toc233314059"/>
       <w:r>
-        <w:t>3.3 Padronização (</w:t>
-      </w:r>
-      <w:proofErr w:type="spellStart"/>
-      <w:r>
-        <w:t>StandardScaler</w:t>
-      </w:r>
-      <w:proofErr w:type="spellEnd"/>
-      <w:r>
-        <w:t>)</w:t>
+        <w:t>3.3 Padronização (StandardScaler)</w:t>
       </w:r>
       <w:bookmarkEnd w:id="21"/>
       <w:bookmarkEnd w:id="22"/>
@@ -5449,42 +5184,13 @@
         <w:spacing w:after="160"/>
       </w:pPr>
       <w:r>
-        <w:t xml:space="preserve">Para evitar data </w:t>
-      </w:r>
-      <w:proofErr w:type="spellStart"/>
-      <w:r>
-        <w:t>leakage</w:t>
-      </w:r>
-      <w:proofErr w:type="spellEnd"/>
+        <w:t>Para evitar data leakage</w:t>
+      </w:r>
       <w:r>
         <w:t xml:space="preserve">, </w:t>
       </w:r>
       <w:r>
-        <w:t xml:space="preserve">o </w:t>
-      </w:r>
-      <w:proofErr w:type="spellStart"/>
-      <w:r>
-        <w:t>scaler</w:t>
-      </w:r>
-      <w:proofErr w:type="spellEnd"/>
-      <w:r>
-        <w:t xml:space="preserve"> foi ajustado (</w:t>
-      </w:r>
-      <w:proofErr w:type="spellStart"/>
-      <w:r>
-        <w:t>fit_transform</w:t>
-      </w:r>
-      <w:proofErr w:type="spellEnd"/>
-      <w:r>
-        <w:t>) exclusivamente com os dados de treino, e aplicado (</w:t>
-      </w:r>
-      <w:proofErr w:type="spellStart"/>
-      <w:r>
-        <w:t>transform</w:t>
-      </w:r>
-      <w:proofErr w:type="spellEnd"/>
-      <w:r>
-        <w:t>, sem reajuste) aos dados de teste.</w:t>
+        <w:t>o scaler foi ajustado (fit_transform) exclusivamente com os dados de treino, e aplicado (transform, sem reajuste) aos dados de teste.</w:t>
       </w:r>
     </w:p>
     <w:p>
@@ -5528,23 +5234,7 @@
         <w:spacing w:after="160"/>
       </w:pPr>
       <w:r>
-        <w:t xml:space="preserve">Usei o modelo linear/estatístico clássico, que calcula uma combinação linear das features e converte o resultado em uma probabilidade de diagnóstico maligno. Vantagem: alta </w:t>
-      </w:r>
-      <w:proofErr w:type="spellStart"/>
-      <w:r>
-        <w:t>interpretabilidade</w:t>
-      </w:r>
-      <w:proofErr w:type="spellEnd"/>
-      <w:r>
-        <w:t xml:space="preserve"> direta dos coeficientes. Limitação conhecida: sensibilidade à </w:t>
-      </w:r>
-      <w:proofErr w:type="spellStart"/>
-      <w:r>
-        <w:t>multicolinearidade</w:t>
-      </w:r>
-      <w:proofErr w:type="spellEnd"/>
-      <w:r>
-        <w:t xml:space="preserve"> identificada anteriormente e retomarei com evidências a frente.</w:t>
+        <w:t>Usei o modelo linear/estatístico clássico, que calcula uma combinação linear das features e converte o resultado em uma probabilidade de diagnóstico maligno. Vantagem: alta interpretabilidade direta dos coeficientes. Limitação conhecida: sensibilidade à multicolinearidade identificada anteriormente e retomarei com evidências a frente.</w:t>
       </w:r>
     </w:p>
     <w:p>
@@ -5562,23 +5252,7 @@
         <w:spacing w:after="160"/>
       </w:pPr>
       <w:r>
-        <w:t xml:space="preserve">Ensemble de múltiplas Árvores de Decisão, cada uma treinada sobre um subconjunto aleatório dos dados, com decisão final por votação majoritária. Vantagem: captura relações não-lineares entre features e é naturalmente robusto à </w:t>
-      </w:r>
-      <w:proofErr w:type="spellStart"/>
-      <w:r>
-        <w:t>multicolinearidade</w:t>
-      </w:r>
-      <w:proofErr w:type="spellEnd"/>
-      <w:r>
-        <w:t xml:space="preserve">. Limitação: menor </w:t>
-      </w:r>
-      <w:proofErr w:type="spellStart"/>
-      <w:r>
-        <w:t>interpretabilidade</w:t>
-      </w:r>
-      <w:proofErr w:type="spellEnd"/>
-      <w:r>
-        <w:t xml:space="preserve"> direta, compensada pela análise SHAP.</w:t>
+        <w:t>Ensemble de múltiplas Árvores de Decisão, cada uma treinada sobre um subconjunto aleatório dos dados, com decisão final por votação majoritária. Vantagem: captura relações não-lineares entre features e é naturalmente robusto à multicolinearidade. Limitação: menor interpretabilidade direta, compensada pela análise SHAP.</w:t>
       </w:r>
     </w:p>
     <w:p>
@@ -5587,23 +5261,7 @@
       </w:pPr>
       <w:bookmarkStart w:id="27" w:name="_Toc233314063"/>
       <w:r>
-        <w:t>4.3 KNN (K-</w:t>
-      </w:r>
-      <w:proofErr w:type="spellStart"/>
-      <w:r>
-        <w:t>Nearest</w:t>
-      </w:r>
-      <w:proofErr w:type="spellEnd"/>
-      <w:r>
-        <w:t xml:space="preserve"> </w:t>
-      </w:r>
-      <w:proofErr w:type="spellStart"/>
-      <w:r>
-        <w:t>Neighbors</w:t>
-      </w:r>
-      <w:proofErr w:type="spellEnd"/>
-      <w:r>
-        <w:t>, k=5)</w:t>
+        <w:t>4.3 KNN (K-Nearest Neighbors, k=5)</w:t>
       </w:r>
       <w:bookmarkEnd w:id="27"/>
     </w:p>
@@ -5630,47 +5288,7 @@
         <w:spacing w:after="160"/>
       </w:pPr>
       <w:r>
-        <w:t>A implementação foi centralizada em um módulo Python reutilizável (</w:t>
-      </w:r>
-      <w:proofErr w:type="spellStart"/>
-      <w:r>
-        <w:t>src</w:t>
-      </w:r>
-      <w:proofErr w:type="spellEnd"/>
-      <w:r>
-        <w:t xml:space="preserve">/models.py), com uma função </w:t>
-      </w:r>
-      <w:proofErr w:type="spellStart"/>
-      <w:r>
-        <w:t>get_</w:t>
-      </w:r>
-      <w:proofErr w:type="gramStart"/>
-      <w:r>
-        <w:t>model</w:t>
-      </w:r>
-      <w:proofErr w:type="spellEnd"/>
-      <w:r>
-        <w:t>(</w:t>
-      </w:r>
-      <w:proofErr w:type="gramEnd"/>
-      <w:r>
-        <w:t xml:space="preserve">) que retorna a instância do modelo solicitado, e </w:t>
-      </w:r>
-      <w:proofErr w:type="spellStart"/>
-      <w:r>
-        <w:t>train_</w:t>
-      </w:r>
-      <w:proofErr w:type="gramStart"/>
-      <w:r>
-        <w:t>model</w:t>
-      </w:r>
-      <w:proofErr w:type="spellEnd"/>
-      <w:r>
-        <w:t>(</w:t>
-      </w:r>
-      <w:proofErr w:type="gramEnd"/>
-      <w:r>
-        <w:t>) que treina diretamente com os dados de treino fornecidos — favorecendo organização de código e reuso entre notebooks.</w:t>
+        <w:t>A implementação foi centralizada em um módulo Python reutilizável (src/models.py), com uma função get_model() que retorna a instância do modelo solicitado, e train_model() que treina diretamente com os dados de treino fornecidos — favorecendo organização de código e reuso entre notebooks.</w:t>
       </w:r>
     </w:p>
     <w:p>
@@ -5808,7 +5426,6 @@
             </w:tcMar>
           </w:tcPr>
           <w:p>
-            <w:proofErr w:type="spellStart"/>
             <w:r>
               <w:rPr>
                 <w:b/>
@@ -5817,7 +5434,6 @@
               </w:rPr>
               <w:t>Accuracy</w:t>
             </w:r>
-            <w:proofErr w:type="spellEnd"/>
           </w:p>
         </w:tc>
         <w:tc>
@@ -5838,7 +5454,6 @@
             </w:tcMar>
           </w:tcPr>
           <w:p>
-            <w:proofErr w:type="spellStart"/>
             <w:r>
               <w:rPr>
                 <w:b/>
@@ -5847,7 +5462,6 @@
               </w:rPr>
               <w:t>Precision</w:t>
             </w:r>
-            <w:proofErr w:type="spellEnd"/>
           </w:p>
         </w:tc>
         <w:tc>
@@ -5926,19 +5540,9 @@
             </w:tcMar>
           </w:tcPr>
           <w:p>
-            <w:proofErr w:type="spellStart"/>
-            <w:r>
-              <w:t>Logistic</w:t>
-            </w:r>
-            <w:proofErr w:type="spellEnd"/>
-            <w:r>
-              <w:t xml:space="preserve"> </w:t>
-            </w:r>
-            <w:proofErr w:type="spellStart"/>
-            <w:r>
-              <w:t>Regression</w:t>
-            </w:r>
-            <w:proofErr w:type="spellEnd"/>
+            <w:r>
+              <w:t>Logistic Regression</w:t>
+            </w:r>
           </w:p>
         </w:tc>
         <w:tc>
@@ -6279,15 +5883,7 @@
         <w:spacing w:after="160"/>
       </w:pPr>
       <w:r>
-        <w:t xml:space="preserve">Os três modelos apresentaram desempenho elevado. No split único, o Random Forest se destacou com </w:t>
-      </w:r>
-      <w:proofErr w:type="spellStart"/>
-      <w:r>
-        <w:t>precision</w:t>
-      </w:r>
-      <w:proofErr w:type="spellEnd"/>
-      <w:r>
-        <w:t xml:space="preserve"> de 100% (nenhum falso positivo no conjunto de teste) e a maior acurácia/F1, empatando com a Regressão Logística em recall.</w:t>
+        <w:t>Os três modelos apresentaram desempenho elevado. No split único, o Random Forest se destacou com precision de 100% (nenhum falso positivo no conjunto de teste) e a maior acurácia/F1, empatando com a Regressão Logística em recall.</w:t>
       </w:r>
     </w:p>
     <w:p>
@@ -6295,15 +5891,7 @@
         <w:spacing w:after="160"/>
       </w:pPr>
       <w:r>
-        <w:t xml:space="preserve">Contudo é importante ressaltar que um </w:t>
-      </w:r>
-      <w:proofErr w:type="spellStart"/>
-      <w:r>
-        <w:t>precision</w:t>
-      </w:r>
-      <w:proofErr w:type="spellEnd"/>
-      <w:r>
-        <w:t xml:space="preserve"> de 100% em um conjunto de teste de apenas 114 amostras é um resultado a ser interpretado com cautela, pode refletir generalização real ou favorecimento parcial pela composição específica desse split. Isso motivou a realização de validação cruzada antes de eleger um modelo como superior.</w:t>
+        <w:t>Contudo é importante ressaltar que um precision de 100% em um conjunto de teste de apenas 114 amostras é um resultado a ser interpretado com cautela, pode refletir generalização real ou favorecimento parcial pela composição específica desse split. Isso motivou a realização de validação cruzada antes de eleger um modelo como superior.</w:t>
       </w:r>
     </w:p>
     <w:p>
@@ -6313,23 +5901,7 @@
       <w:bookmarkStart w:id="35" w:name="sec5_3"/>
       <w:bookmarkStart w:id="36" w:name="_Toc233314068"/>
       <w:r>
-        <w:t xml:space="preserve">5.3 Validação cruzada (5-fold </w:t>
-      </w:r>
-      <w:proofErr w:type="spellStart"/>
-      <w:r>
-        <w:t>Stratified</w:t>
-      </w:r>
-      <w:proofErr w:type="spellEnd"/>
-      <w:r>
-        <w:t xml:space="preserve"> Cross-</w:t>
-      </w:r>
-      <w:proofErr w:type="spellStart"/>
-      <w:r>
-        <w:t>Validation</w:t>
-      </w:r>
-      <w:proofErr w:type="spellEnd"/>
-      <w:r>
-        <w:t>)</w:t>
+        <w:t>5.3 Validação cruzada (5-fold Stratified Cross-Validation)</w:t>
       </w:r>
       <w:bookmarkEnd w:id="35"/>
       <w:bookmarkEnd w:id="36"/>
@@ -6345,95 +5917,7 @@
         <w:t xml:space="preserve">apliquei </w:t>
       </w:r>
       <w:r>
-        <w:t xml:space="preserve">validação cruzada estratificada com 5 </w:t>
-      </w:r>
-      <w:proofErr w:type="spellStart"/>
-      <w:r>
-        <w:t>folds</w:t>
-      </w:r>
-      <w:proofErr w:type="spellEnd"/>
-      <w:r>
-        <w:t xml:space="preserve"> (</w:t>
-      </w:r>
-      <w:proofErr w:type="spellStart"/>
-      <w:r>
-        <w:t>StratifiedKFold</w:t>
-      </w:r>
-      <w:proofErr w:type="spellEnd"/>
-      <w:r>
-        <w:t xml:space="preserve">, </w:t>
-      </w:r>
-      <w:proofErr w:type="spellStart"/>
-      <w:r>
-        <w:t>shuffle</w:t>
-      </w:r>
-      <w:proofErr w:type="spellEnd"/>
-      <w:r>
-        <w:t>=</w:t>
-      </w:r>
-      <w:proofErr w:type="spellStart"/>
-      <w:r>
-        <w:t>True</w:t>
-      </w:r>
-      <w:proofErr w:type="spellEnd"/>
-      <w:r>
-        <w:t xml:space="preserve">, </w:t>
-      </w:r>
-      <w:proofErr w:type="spellStart"/>
-      <w:r>
-        <w:t>random_state</w:t>
-      </w:r>
-      <w:proofErr w:type="spellEnd"/>
-      <w:r>
-        <w:t xml:space="preserve">=42), com a </w:t>
-      </w:r>
-      <w:proofErr w:type="gramStart"/>
-      <w:r>
-        <w:t>métrica recall</w:t>
-      </w:r>
-      <w:proofErr w:type="gramEnd"/>
-      <w:r>
-        <w:t xml:space="preserve">. O pré-processamento (padronização) foi encapsulado em um Pipeline do </w:t>
-      </w:r>
-      <w:proofErr w:type="spellStart"/>
-      <w:r>
-        <w:t>scikit-learn</w:t>
-      </w:r>
-      <w:proofErr w:type="spellEnd"/>
-      <w:r>
-        <w:t xml:space="preserve">, garantindo que o </w:t>
-      </w:r>
-      <w:proofErr w:type="spellStart"/>
-      <w:r>
-        <w:t>StandardScaler</w:t>
-      </w:r>
-      <w:proofErr w:type="spellEnd"/>
-      <w:r>
-        <w:t xml:space="preserve"> fosse reajustado a cada </w:t>
-      </w:r>
-      <w:proofErr w:type="spellStart"/>
-      <w:r>
-        <w:t>fold</w:t>
-      </w:r>
-      <w:proofErr w:type="spellEnd"/>
-      <w:r>
-        <w:t xml:space="preserve"> evitando data </w:t>
-      </w:r>
-      <w:proofErr w:type="spellStart"/>
-      <w:r>
-        <w:t>leakage</w:t>
-      </w:r>
-      <w:proofErr w:type="spellEnd"/>
-      <w:r>
-        <w:t xml:space="preserve"> entre </w:t>
-      </w:r>
-      <w:proofErr w:type="spellStart"/>
-      <w:r>
-        <w:t>folds</w:t>
-      </w:r>
-      <w:proofErr w:type="spellEnd"/>
-      <w:r>
-        <w:t>.</w:t>
+        <w:t>validação cruzada estratificada com 5 folds (StratifiedKFold, shuffle=True, random_state=42), com a métrica recall. O pré-processamento (padronização) foi encapsulado em um Pipeline do scikit-learn, garantindo que o StandardScaler fosse reajustado a cada fold evitando data leakage entre folds.</w:t>
       </w:r>
     </w:p>
     <w:tbl>
@@ -6563,19 +6047,9 @@
             </w:tcMar>
           </w:tcPr>
           <w:p>
-            <w:proofErr w:type="spellStart"/>
-            <w:r>
-              <w:t>Logistic</w:t>
-            </w:r>
-            <w:proofErr w:type="spellEnd"/>
-            <w:r>
-              <w:t xml:space="preserve"> </w:t>
-            </w:r>
-            <w:proofErr w:type="spellStart"/>
-            <w:r>
-              <w:t>Regression</w:t>
-            </w:r>
-            <w:proofErr w:type="spellEnd"/>
+            <w:r>
+              <w:t>Logistic Regression</w:t>
+            </w:r>
           </w:p>
         </w:tc>
         <w:tc>
@@ -6950,25 +6424,7 @@
                 <w:bCs/>
                 <w:color w:val="FFFFFF"/>
               </w:rPr>
-              <w:t>Falsos Negativos (</w:t>
-            </w:r>
-            <w:proofErr w:type="spellStart"/>
-            <w:r>
-              <w:rPr>
-                <w:b/>
-                <w:bCs/>
-                <w:color w:val="FFFFFF"/>
-              </w:rPr>
-              <w:t>Maligno→Benigno</w:t>
-            </w:r>
-            <w:proofErr w:type="spellEnd"/>
-            <w:r>
-              <w:rPr>
-                <w:b/>
-                <w:bCs/>
-                <w:color w:val="FFFFFF"/>
-              </w:rPr>
-              <w:t>)</w:t>
+              <w:t>Falsos Negativos (Maligno→Benigno)</w:t>
             </w:r>
           </w:p>
         </w:tc>
@@ -6996,25 +6452,7 @@
                 <w:bCs/>
                 <w:color w:val="FFFFFF"/>
               </w:rPr>
-              <w:t>Falsos Positivos (</w:t>
-            </w:r>
-            <w:proofErr w:type="spellStart"/>
-            <w:r>
-              <w:rPr>
-                <w:b/>
-                <w:bCs/>
-                <w:color w:val="FFFFFF"/>
-              </w:rPr>
-              <w:t>Benigno→Maligno</w:t>
-            </w:r>
-            <w:proofErr w:type="spellEnd"/>
-            <w:r>
-              <w:rPr>
-                <w:b/>
-                <w:bCs/>
-                <w:color w:val="FFFFFF"/>
-              </w:rPr>
-              <w:t>)</w:t>
+              <w:t>Falsos Positivos (Benigno→Maligno)</w:t>
             </w:r>
           </w:p>
         </w:tc>
@@ -7038,19 +6476,9 @@
             </w:tcMar>
           </w:tcPr>
           <w:p>
-            <w:proofErr w:type="spellStart"/>
-            <w:r>
-              <w:t>Logistic</w:t>
-            </w:r>
-            <w:proofErr w:type="spellEnd"/>
-            <w:r>
-              <w:t xml:space="preserve"> </w:t>
-            </w:r>
-            <w:proofErr w:type="spellStart"/>
-            <w:r>
-              <w:t>Regression</w:t>
-            </w:r>
-            <w:proofErr w:type="spellEnd"/>
+            <w:r>
+              <w:t>Logistic Regression</w:t>
+            </w:r>
           </w:p>
         </w:tc>
         <w:tc>
@@ -7307,15 +6735,7 @@
       <w:bookmarkStart w:id="42" w:name="_Toc233314071"/>
       <w:r>
         <w:lastRenderedPageBreak/>
-        <w:t xml:space="preserve">6. </w:t>
-      </w:r>
-      <w:proofErr w:type="spellStart"/>
-      <w:r>
-        <w:t>Interpretabilidade</w:t>
-      </w:r>
-      <w:proofErr w:type="spellEnd"/>
-      <w:r>
-        <w:t xml:space="preserve"> (SHAP)</w:t>
+        <w:t>6. Interpretabilidade (SHAP)</w:t>
       </w:r>
       <w:bookmarkEnd w:id="41"/>
       <w:bookmarkEnd w:id="42"/>
@@ -7325,47 +6745,7 @@
         <w:spacing w:after="160"/>
       </w:pPr>
       <w:r>
-        <w:t>SHAP (</w:t>
-      </w:r>
-      <w:proofErr w:type="spellStart"/>
-      <w:r>
-        <w:t>SHapley</w:t>
-      </w:r>
-      <w:proofErr w:type="spellEnd"/>
-      <w:r>
-        <w:t xml:space="preserve"> </w:t>
-      </w:r>
-      <w:proofErr w:type="spellStart"/>
-      <w:r>
-        <w:t>Additive</w:t>
-      </w:r>
-      <w:proofErr w:type="spellEnd"/>
-      <w:r>
-        <w:t xml:space="preserve"> </w:t>
-      </w:r>
-      <w:proofErr w:type="spellStart"/>
-      <w:r>
-        <w:t>exPlanations</w:t>
-      </w:r>
-      <w:proofErr w:type="spellEnd"/>
-      <w:r>
-        <w:t xml:space="preserve">) é uma técnica de </w:t>
-      </w:r>
-      <w:proofErr w:type="spellStart"/>
-      <w:r>
-        <w:t>interpretabilidade</w:t>
-      </w:r>
-      <w:proofErr w:type="spellEnd"/>
-      <w:r>
-        <w:t xml:space="preserve"> baseada em teoria dos jogos, que estima a contribuição individual de cada feature para uma previsão específica. Diferente da correlação (que descreve uma relação geral entre uma feature e o alvo, considerando todo o </w:t>
-      </w:r>
-      <w:proofErr w:type="spellStart"/>
-      <w:r>
-        <w:t>dataset</w:t>
-      </w:r>
-      <w:proofErr w:type="spellEnd"/>
-      <w:r>
-        <w:t>), o SHAP permite responder: "para esta paciente específica, o quanto cada característica empurrou a previsão para maligno ou benigno?" — e, agregando essas contribuições, obtém-se também uma medida de importância global de cada feature para o modelo.</w:t>
+        <w:t>SHAP (SHapley Additive exPlanations) é uma técnica de interpretabilidade baseada em teoria dos jogos, que estima a contribuição individual de cada feature para uma previsão específica. Diferente da correlação (que descreve uma relação geral entre uma feature e o alvo, considerando todo o dataset), o SHAP permite responder: "para esta paciente específica, o quanto cada característica empurrou a previsão para maligno ou benigno?" — e, agregando essas contribuições, obtém-se também uma medida de importância global de cada feature para o modelo.</w:t>
       </w:r>
     </w:p>
     <w:p>
@@ -7385,17 +6765,7 @@
         <w:spacing w:after="160"/>
       </w:pPr>
       <w:r>
-        <w:t xml:space="preserve">A análise SHAP foi inicialmente aplicada à Regressão Logística (modelo escolhido como mais robusto na validação cruzada), utilizando </w:t>
-      </w:r>
-      <w:proofErr w:type="spellStart"/>
-      <w:proofErr w:type="gramStart"/>
-      <w:r>
-        <w:t>shap.LinearExplainer</w:t>
-      </w:r>
-      <w:proofErr w:type="spellEnd"/>
-      <w:proofErr w:type="gramEnd"/>
-      <w:r>
-        <w:t>. O ranking de importância resultante apontou texture3 e radius2 como as duas features mais influentes no modelo</w:t>
+        <w:t>A análise SHAP foi inicialmente aplicada à Regressão Logística (modelo escolhido como mais robusto na validação cruzada), utilizando shap.LinearExplainer. O ranking de importância resultante apontou texture3 e radius2 como as duas features mais influentes no modelo</w:t>
       </w:r>
       <w:r>
         <w:t>,</w:t>
@@ -7429,15 +6799,7 @@
         <w:spacing w:after="160"/>
       </w:pPr>
       <w:r>
-        <w:t xml:space="preserve">Me aprofundei para tentar encontrar a causa dessa divergência. Três verificações independentes confirmaram a hipótese de </w:t>
-      </w:r>
-      <w:proofErr w:type="spellStart"/>
-      <w:r>
-        <w:t>multicolinearidade</w:t>
-      </w:r>
-      <w:proofErr w:type="spellEnd"/>
-      <w:r>
-        <w:t xml:space="preserve"> distorcendo os coeficientes da Regressão Logística como esperado:</w:t>
+        <w:t>Me aprofundei para tentar encontrar a causa dessa divergência. Três verificações independentes confirmaram a hipótese de multicolinearidade distorcendo os coeficientes da Regressão Logística como esperado:</w:t>
       </w:r>
     </w:p>
     <w:p>
@@ -7456,15 +6818,7 @@
         <w:t xml:space="preserve"> e</w:t>
       </w:r>
       <w:r>
-        <w:t xml:space="preserve"> não na ferramenta de </w:t>
-      </w:r>
-      <w:proofErr w:type="spellStart"/>
-      <w:r>
-        <w:t>interpretabilidade</w:t>
-      </w:r>
-      <w:proofErr w:type="spellEnd"/>
-      <w:r>
-        <w:t>;</w:t>
+        <w:t xml:space="preserve"> não na ferramenta de interpretabilidade;</w:t>
       </w:r>
     </w:p>
     <w:p>
@@ -7477,39 +6831,7 @@
         <w:spacing w:after="100"/>
       </w:pPr>
       <w:r>
-        <w:t xml:space="preserve">Correlação entre variantes da mesma característica: radius1 </w:t>
-      </w:r>
-      <w:proofErr w:type="spellStart"/>
-      <w:r>
-        <w:t>vs</w:t>
-      </w:r>
-      <w:proofErr w:type="spellEnd"/>
-      <w:r>
-        <w:t xml:space="preserve"> radius3 = 0.97; radius1 </w:t>
-      </w:r>
-      <w:proofErr w:type="spellStart"/>
-      <w:r>
-        <w:t>vs</w:t>
-      </w:r>
-      <w:proofErr w:type="spellEnd"/>
-      <w:r>
-        <w:t xml:space="preserve"> radius2 = 0.68; texture1 </w:t>
-      </w:r>
-      <w:proofErr w:type="spellStart"/>
-      <w:r>
-        <w:t>vs</w:t>
-      </w:r>
-      <w:proofErr w:type="spellEnd"/>
-      <w:r>
-        <w:t xml:space="preserve"> texture3 = 0.91 confirmando alta </w:t>
-      </w:r>
-      <w:proofErr w:type="spellStart"/>
-      <w:r>
-        <w:t>multicolinearidade</w:t>
-      </w:r>
-      <w:proofErr w:type="spellEnd"/>
-      <w:r>
-        <w:t xml:space="preserve"> exatamente nas features que herdaram peso desproporcional;</w:t>
+        <w:t>Correlação entre variantes da mesma característica: radius1 vs radius3 = 0.97; radius1 vs radius2 = 0.68; texture1 vs texture3 = 0.91 confirmando alta multicolinearidade exatamente nas features que herdaram peso desproporcional;</w:t>
       </w:r>
     </w:p>
     <w:p>
@@ -7522,23 +6844,7 @@
         <w:spacing w:after="100"/>
       </w:pPr>
       <w:r>
-        <w:t>Comparação com SHAP do Random Forest (</w:t>
-      </w:r>
-      <w:proofErr w:type="spellStart"/>
-      <w:r>
-        <w:t>TreeExplainer</w:t>
-      </w:r>
-      <w:proofErr w:type="spellEnd"/>
-      <w:r>
-        <w:t xml:space="preserve">, naturalmente robusto à </w:t>
-      </w:r>
-      <w:proofErr w:type="spellStart"/>
-      <w:r>
-        <w:t>multicolinearidade</w:t>
-      </w:r>
-      <w:proofErr w:type="spellEnd"/>
-      <w:r>
-        <w:t>): o ranking do Random Forest elegeu como top-5 area3, concave_points3, radius3, concave_points1 e perimeter3 exatamente as features já identificadas como mais correlacionadas com o diagnóstico. Já texture3 e radius2 caíram para as posições 13ª e 14ª neste ranking.</w:t>
+        <w:t>Comparação com SHAP do Random Forest (TreeExplainer, naturalmente robusto à multicolinearidade): o ranking do Random Forest elegeu como top-5 area3, concave_points3, radius3, concave_points1 e perimeter3 exatamente as features já identificadas como mais correlacionadas com o diagnóstico. Já texture3 e radius2 caíram para as posições 13ª e 14ª neste ranking.</w:t>
       </w:r>
     </w:p>
     <w:p>
@@ -7648,15 +6954,10 @@
       <w:bookmarkStart w:id="47" w:name="sec6_3"/>
       <w:bookmarkStart w:id="48" w:name="_Toc233314074"/>
       <w:r>
-        <w:t xml:space="preserve">6.3 Conclusão sobre </w:t>
-      </w:r>
-      <w:proofErr w:type="spellStart"/>
-      <w:r>
-        <w:t>interpretabilidade</w:t>
+        <w:t>6.3 Conclusão sobre interpretabilidade</w:t>
       </w:r>
       <w:bookmarkEnd w:id="47"/>
       <w:bookmarkEnd w:id="48"/>
-      <w:proofErr w:type="spellEnd"/>
     </w:p>
     <w:p>
       <w:pPr>
@@ -7669,15 +6970,7 @@
         <w:t>anteriormente</w:t>
       </w:r>
       <w:r>
-        <w:t xml:space="preserve">: a </w:t>
-      </w:r>
-      <w:proofErr w:type="spellStart"/>
-      <w:r>
-        <w:t>multicolinearidade</w:t>
-      </w:r>
-      <w:proofErr w:type="spellEnd"/>
-      <w:r>
-        <w:t xml:space="preserve"> entre features afeta a estabilidade dos coeficientes da Regressão Logística, fazendo com que features correlacionadas</w:t>
+        <w:t>: a multicolinearidade entre features afeta a estabilidade dos coeficientes da Regressão Logística, fazendo com que features correlacionadas</w:t>
       </w:r>
       <w:r>
         <w:t>,</w:t>
@@ -7697,31 +6990,7 @@
         <w:spacing w:after="160"/>
       </w:pPr>
       <w:r>
-        <w:t xml:space="preserve">Por isso acabei decidindo por manter a Regressão Logística como modelo preditivo principal do projeto, por apresentar o maior recall médio em validação cruzada, a </w:t>
-      </w:r>
-      <w:proofErr w:type="spellStart"/>
-      <w:r>
-        <w:t>multicolinearidade</w:t>
-      </w:r>
-      <w:proofErr w:type="spellEnd"/>
-      <w:r>
-        <w:t xml:space="preserve"> não compromete a capacidade preditiva do modelo, apenas a </w:t>
-      </w:r>
-      <w:proofErr w:type="spellStart"/>
-      <w:r>
-        <w:t>interpretabilidade</w:t>
-      </w:r>
-      <w:proofErr w:type="spellEnd"/>
-      <w:r>
-        <w:t xml:space="preserve"> direta de seus coeficientes individuais. Para fins de interpretação clínica de quais características mais influenciam o diagnóstico, adota-se o ranking de importância do Random Forest como referência, por ser robusto à </w:t>
-      </w:r>
-      <w:proofErr w:type="spellStart"/>
-      <w:r>
-        <w:t>multicolinearidade</w:t>
-      </w:r>
-      <w:proofErr w:type="spellEnd"/>
-      <w:r>
-        <w:t xml:space="preserve"> e concordar com a análise de correlação simples e os padrões visuais identificados na EDA.</w:t>
+        <w:t>Por isso acabei decidindo por manter a Regressão Logística como modelo preditivo principal do projeto, por apresentar o maior recall médio em validação cruzada, a multicolinearidade não compromete a capacidade preditiva do modelo, apenas a interpretabilidade direta de seus coeficientes individuais. Para fins de interpretação clínica de quais características mais influenciam o diagnóstico, adota-se o ranking de importância do Random Forest como referência, por ser robusto à multicolinearidade e concordar com a análise de correlação simples e os padrões visuais identificados na EDA.</w:t>
       </w:r>
     </w:p>
     <w:p>
@@ -7730,63 +6999,7 @@
       </w:pPr>
       <w:r>
         <w:lastRenderedPageBreak/>
-        <w:t xml:space="preserve">Dado isso, </w:t>
-      </w:r>
-      <w:proofErr w:type="spellStart"/>
-      <w:r>
-        <w:t>podemo</w:t>
-      </w:r>
-      <w:proofErr w:type="spellEnd"/>
-      <w:r>
-        <w:t xml:space="preserve"> concluir que o tamanho (</w:t>
-      </w:r>
-      <w:proofErr w:type="spellStart"/>
-      <w:r>
-        <w:t>radius</w:t>
-      </w:r>
-      <w:proofErr w:type="spellEnd"/>
-      <w:r>
-        <w:t xml:space="preserve">, </w:t>
-      </w:r>
-      <w:proofErr w:type="spellStart"/>
-      <w:r>
-        <w:t>area</w:t>
-      </w:r>
-      <w:proofErr w:type="spellEnd"/>
-      <w:r>
-        <w:t xml:space="preserve">, </w:t>
-      </w:r>
-      <w:proofErr w:type="spellStart"/>
-      <w:r>
-        <w:t>perimeter</w:t>
-      </w:r>
-      <w:proofErr w:type="spellEnd"/>
-      <w:r>
-        <w:t>) e irregularidade de contorno (</w:t>
-      </w:r>
-      <w:proofErr w:type="spellStart"/>
-      <w:r>
-        <w:t>concavity</w:t>
-      </w:r>
-      <w:proofErr w:type="spellEnd"/>
-      <w:r>
-        <w:t xml:space="preserve">, </w:t>
-      </w:r>
-      <w:proofErr w:type="spellStart"/>
-      <w:r>
-        <w:t>concave_points</w:t>
-      </w:r>
-      <w:proofErr w:type="spellEnd"/>
-      <w:r>
-        <w:t xml:space="preserve">) do núcleo celular, especialmente nas medições de "pior caso", são os indicadores mais fortes de malignidade neste </w:t>
-      </w:r>
-      <w:proofErr w:type="spellStart"/>
-      <w:r>
-        <w:t>dataset</w:t>
-      </w:r>
-      <w:proofErr w:type="spellEnd"/>
-      <w:r>
-        <w:t>.</w:t>
+        <w:t>Dado isso, podemo concluir que o tamanho (radius, area, perimeter) e irregularidade de contorno (concavity, concave_points) do núcleo celular, especialmente nas medições de "pior caso", são os indicadores mais fortes de malignidade neste dataset.</w:t>
       </w:r>
     </w:p>
     <w:p>
@@ -7794,15 +7007,7 @@
         <w:spacing w:after="160"/>
       </w:pPr>
       <w:r>
-        <w:t xml:space="preserve">Este episódio metodológico ilustra a importância de validar resultados de </w:t>
-      </w:r>
-      <w:proofErr w:type="spellStart"/>
-      <w:r>
-        <w:t>interpretabilidade</w:t>
-      </w:r>
-      <w:proofErr w:type="spellEnd"/>
-      <w:r>
-        <w:t xml:space="preserve"> contra múltiplas fontes de evidência</w:t>
+        <w:t>Este episódio metodológico ilustra a importância de validar resultados de interpretabilidade contra múltiplas fontes de evidência</w:t>
       </w:r>
       <w:r>
         <w:t xml:space="preserve">, </w:t>
@@ -7936,15 +7141,7 @@
         <w:spacing w:after="100"/>
       </w:pPr>
       <w:r>
-        <w:t xml:space="preserve">A </w:t>
-      </w:r>
-      <w:proofErr w:type="spellStart"/>
-      <w:r>
-        <w:t>multicolinearidade</w:t>
-      </w:r>
-      <w:proofErr w:type="spellEnd"/>
-      <w:r>
-        <w:t xml:space="preserve"> entre features compromete a confiabilidade dos coeficientes individuais da Regressão Logística como medida direta de importância</w:t>
+        <w:t>A multicolinearidade entre features compromete a confiabilidade dos coeficientes individuais da Regressão Logística como medida direta de importância</w:t>
       </w:r>
       <w:r>
         <w:t xml:space="preserve">, </w:t>
@@ -7963,15 +7160,7 @@
         <w:spacing w:after="100"/>
       </w:pPr>
       <w:r>
-        <w:t xml:space="preserve">O </w:t>
-      </w:r>
-      <w:proofErr w:type="spellStart"/>
-      <w:r>
-        <w:t>dataset</w:t>
-      </w:r>
-      <w:proofErr w:type="spellEnd"/>
-      <w:r>
-        <w:t>, apesar de amplamente validado na literatura acadêmica, tem origem em um único centro de pesquisa, o que pode limitar a generalização para populações com características demográficas distintas;</w:t>
+        <w:t>O dataset, apesar de amplamente validado na literatura acadêmica, tem origem em um único centro de pesquisa, o que pode limitar a generalização para populações com características demográficas distintas;</w:t>
       </w:r>
     </w:p>
     <w:p>
@@ -8022,23 +7211,7 @@
         <w:t>passando pelas</w:t>
       </w:r>
       <w:r>
-        <w:t xml:space="preserve"> etapas técnicas: análise exploratória, pré-processamento com prevenção de data </w:t>
-      </w:r>
-      <w:proofErr w:type="spellStart"/>
-      <w:r>
-        <w:t>leakage</w:t>
-      </w:r>
-      <w:proofErr w:type="spellEnd"/>
-      <w:r>
-        <w:t xml:space="preserve">, modelagem comparativa com três algoritmos distintos, avaliação rigorosa (incluindo validação cruzada e matriz de confusão) e </w:t>
-      </w:r>
-      <w:proofErr w:type="spellStart"/>
-      <w:r>
-        <w:t>interpretabilidade</w:t>
-      </w:r>
-      <w:proofErr w:type="spellEnd"/>
-      <w:r>
-        <w:t xml:space="preserve"> via SHAP.</w:t>
+        <w:t xml:space="preserve"> etapas técnicas: análise exploratória, pré-processamento com prevenção de data leakage, modelagem comparativa com três algoritmos distintos, avaliação rigorosa (incluindo validação cruzada e matriz de confusão) e interpretabilidade via SHAP.</w:t>
       </w:r>
     </w:p>
     <w:p>
@@ -8046,34 +7219,13 @@
         <w:spacing w:after="160"/>
       </w:pPr>
       <w:r>
-        <w:t xml:space="preserve">Um dos resultados mais relevantes do processo não foi apenas a seleção de um modelo de melhor desempenho, mas a identificação e investigação ativa de uma divergência metodológica na análise de </w:t>
-      </w:r>
-      <w:proofErr w:type="spellStart"/>
-      <w:r>
-        <w:t>interpretabilidade</w:t>
-      </w:r>
-      <w:proofErr w:type="spellEnd"/>
+        <w:t>Um dos resultados mais relevantes do processo não foi apenas a seleção de um modelo de melhor desempenho, mas a identificação e investigação ativa de uma divergência metodológica na análise de interpretabilidade</w:t>
+      </w:r>
       <w:r>
         <w:t>,</w:t>
       </w:r>
       <w:r>
-        <w:t xml:space="preserve"> confirmando, com evidências concretas, uma limitação teórica prevista desde as etapas iniciais do projeto (</w:t>
-      </w:r>
-      <w:proofErr w:type="spellStart"/>
-      <w:r>
-        <w:t>multicolinearidade</w:t>
-      </w:r>
-      <w:proofErr w:type="spellEnd"/>
-      <w:r>
-        <w:t xml:space="preserve"> entre features). Esse processo de verificação cruzada entre fontes de evidência (correlação, EDA visual, e dois métodos de </w:t>
-      </w:r>
-      <w:proofErr w:type="spellStart"/>
-      <w:r>
-        <w:t>interpretabilidade</w:t>
-      </w:r>
-      <w:proofErr w:type="spellEnd"/>
-      <w:r>
-        <w:t>) reforça a robustez das conclusões apresentadas.</w:t>
+        <w:t xml:space="preserve"> confirmando, com evidências concretas, uma limitação teórica prevista desde as etapas iniciais do projeto (multicolinearidade entre features). Esse processo de verificação cruzada entre fontes de evidência (correlação, EDA visual, e dois métodos de interpretabilidade) reforça a robustez das conclusões apresentadas.</w:t>
       </w:r>
     </w:p>
     <w:p>
@@ -8081,15 +7233,7 @@
         <w:spacing w:after="160"/>
       </w:pPr>
       <w:r>
-        <w:t xml:space="preserve">A Regressão Logística foi selecionada como modelo preditivo principal (recall médio de 94.4% em validação cruzada), com a ressalva de que a interpretação de importância de features deve se apoiar no ranking do Random Forest, mais robusto à </w:t>
-      </w:r>
-      <w:proofErr w:type="spellStart"/>
-      <w:r>
-        <w:t>multicolinearidade</w:t>
-      </w:r>
-      <w:proofErr w:type="spellEnd"/>
-      <w:r>
-        <w:t xml:space="preserve"> identificada.</w:t>
+        <w:t>A Regressão Logística foi selecionada como modelo preditivo principal (recall médio de 94.4% em validação cruzada), com a ressalva de que a interpretação de importância de features deve se apoiar no ranking do Random Forest, mais robusto à multicolinearidade identificada.</w:t>
       </w:r>
     </w:p>
     <w:p>
@@ -8164,9 +7308,14 @@
       <w:pPr>
         <w:spacing w:after="160"/>
       </w:pPr>
-      <w:r>
-        <w:t>[link a ser adicionado após a gravação]</w:t>
-      </w:r>
+      <w:hyperlink r:id="rId15" w:history="1">
+        <w:r>
+          <w:rPr>
+            <w:rStyle w:val="Hyperlink"/>
+          </w:rPr>
+          <w:t>https://youtu.be/2JcK82BSrcE</w:t>
+        </w:r>
+      </w:hyperlink>
     </w:p>
     <w:p>
       <w:pPr>
@@ -8174,81 +7323,23 @@
       </w:pPr>
       <w:bookmarkStart w:id="60" w:name="_Toc233314083"/>
       <w:r>
-        <w:t xml:space="preserve">9.3 Fonte do </w:t>
-      </w:r>
-      <w:proofErr w:type="spellStart"/>
-      <w:r>
-        <w:t>dataset</w:t>
+        <w:t>9.3 Fonte do dataset</w:t>
       </w:r>
       <w:bookmarkEnd w:id="60"/>
-      <w:proofErr w:type="spellEnd"/>
     </w:p>
     <w:p>
       <w:pPr>
         <w:spacing w:after="160"/>
       </w:pPr>
-      <w:proofErr w:type="spellStart"/>
-      <w:r>
-        <w:t>Wolberg</w:t>
-      </w:r>
-      <w:proofErr w:type="spellEnd"/>
-      <w:r>
-        <w:t xml:space="preserve">, W., </w:t>
-      </w:r>
-      <w:proofErr w:type="spellStart"/>
-      <w:r>
-        <w:t>Mangasarian</w:t>
-      </w:r>
-      <w:proofErr w:type="spellEnd"/>
-      <w:r>
-        <w:t xml:space="preserve">, O., Street, N., &amp; Street, W. (1995). </w:t>
-      </w:r>
-      <w:proofErr w:type="spellStart"/>
-      <w:r>
-        <w:t>Breast</w:t>
-      </w:r>
-      <w:proofErr w:type="spellEnd"/>
-      <w:r>
-        <w:t xml:space="preserve"> </w:t>
-      </w:r>
-      <w:proofErr w:type="spellStart"/>
-      <w:r>
-        <w:t>Cancer</w:t>
-      </w:r>
-      <w:proofErr w:type="spellEnd"/>
-      <w:r>
-        <w:t xml:space="preserve"> Wisconsin (</w:t>
-      </w:r>
-      <w:proofErr w:type="spellStart"/>
-      <w:r>
-        <w:t>Diagnostic</w:t>
-      </w:r>
-      <w:proofErr w:type="spellEnd"/>
-      <w:r>
-        <w:t>) [</w:t>
-      </w:r>
-      <w:proofErr w:type="spellStart"/>
-      <w:r>
-        <w:t>Dataset</w:t>
-      </w:r>
-      <w:proofErr w:type="spellEnd"/>
-      <w:r>
-        <w:t xml:space="preserve">]. UCI Machine Learning </w:t>
-      </w:r>
-      <w:proofErr w:type="spellStart"/>
-      <w:r>
-        <w:t>Repository</w:t>
-      </w:r>
-      <w:proofErr w:type="spellEnd"/>
-      <w:r>
-        <w:t>. Disponível em: https://archive.ics.uci.edu/dataset/17/breast+cancer+wisconsin+diagnostic</w:t>
+      <w:r>
+        <w:t>Wolberg, W., Mangasarian, O., Street, N., &amp; Street, W. (1995). Breast Cancer Wisconsin (Diagnostic) [Dataset]. UCI Machine Learning Repository. Disponível em: https://archive.ics.uci.edu/dataset/17/breast+cancer+wisconsin+diagnostic</w:t>
       </w:r>
     </w:p>
     <w:sectPr>
-      <w:headerReference w:type="default" r:id="rId15"/>
-      <w:footerReference w:type="default" r:id="rId16"/>
-      <w:headerReference w:type="first" r:id="rId17"/>
-      <w:footerReference w:type="first" r:id="rId18"/>
+      <w:headerReference w:type="default" r:id="rId16"/>
+      <w:footerReference w:type="default" r:id="rId17"/>
+      <w:headerReference w:type="first" r:id="rId18"/>
+      <w:footerReference w:type="first" r:id="rId19"/>
       <w:pgSz w:w="12240" w:h="15840"/>
       <w:pgMar w:top="1440" w:right="1440" w:bottom="1440" w:left="1440" w:header="708" w:footer="708" w:gutter="0"/>
       <w:cols w:space="720"/>
@@ -8374,43 +7465,7 @@
         <w:sz w:val="16"/>
         <w:szCs w:val="16"/>
       </w:rPr>
-      <w:t xml:space="preserve">Tech </w:t>
-    </w:r>
-    <w:proofErr w:type="spellStart"/>
-    <w:r>
-      <w:rPr>
-        <w:color w:val="888888"/>
-        <w:sz w:val="16"/>
-        <w:szCs w:val="16"/>
-      </w:rPr>
-      <w:t>Challenge</w:t>
-    </w:r>
-    <w:proofErr w:type="spellEnd"/>
-    <w:r>
-      <w:rPr>
-        <w:color w:val="888888"/>
-        <w:sz w:val="16"/>
-        <w:szCs w:val="16"/>
-      </w:rPr>
-      <w:t xml:space="preserve"> — Fase 1 | IA para </w:t>
-    </w:r>
-    <w:proofErr w:type="spellStart"/>
-    <w:r>
-      <w:rPr>
-        <w:color w:val="888888"/>
-        <w:sz w:val="16"/>
-        <w:szCs w:val="16"/>
-      </w:rPr>
-      <w:t>Devs</w:t>
-    </w:r>
-    <w:proofErr w:type="spellEnd"/>
-    <w:r>
-      <w:rPr>
-        <w:color w:val="888888"/>
-        <w:sz w:val="16"/>
-        <w:szCs w:val="16"/>
-      </w:rPr>
-      <w:t xml:space="preserve"> — FIAP</w:t>
+      <w:t>Tech Challenge — Fase 1 | IA para Devs — FIAP</w:t>
     </w:r>
   </w:p>
 </w:hdr>

</xml_diff>